<commit_message>
Add unified Master Submission PDF with student names, IDs, groups and direct submission links
</commit_message>
<xml_diff>
--- a/Dashboard_Description_Report.docx
+++ b/Dashboard_Description_Report.docx
@@ -32,6 +32,506 @@
       <w:tblPr>
         <w:tblW w:type="auto" w:w="0"/>
         <w:jc w:val="center"/>
+        <w:tblLayout w:type="fixed"/>
+        <w:tblLook w:firstColumn="1" w:firstRow="1" w:lastColumn="0" w:lastRow="0" w:noHBand="0" w:noVBand="1" w:val="04A0"/>
+      </w:tblPr>
+      <w:tblGrid>
+        <w:gridCol w:w="2340"/>
+        <w:gridCol w:w="2340"/>
+        <w:gridCol w:w="2340"/>
+        <w:gridCol w:w="2340"/>
+      </w:tblGrid>
+      <w:tr>
+        <w:tc>
+          <w:tcPr>
+            <w:tcW w:type="dxa" w:w="3168"/>
+            <w:shd w:fill="0F172A"/>
+          </w:tcPr>
+          <w:p>
+            <w:r>
+              <w:rPr>
+                <w:b/>
+                <w:color w:val="FFFFFF"/>
+                <w:sz w:val="18"/>
+              </w:rPr>
+              <w:t>Student Full Name</w:t>
+            </w:r>
+          </w:p>
+        </w:tc>
+        <w:tc>
+          <w:tcPr>
+            <w:tcW w:type="dxa" w:w="1584"/>
+            <w:shd w:fill="0F172A"/>
+          </w:tcPr>
+          <w:p>
+            <w:r>
+              <w:rPr>
+                <w:b/>
+                <w:color w:val="FFFFFF"/>
+                <w:sz w:val="18"/>
+              </w:rPr>
+              <w:t>Academic ID</w:t>
+            </w:r>
+          </w:p>
+        </w:tc>
+        <w:tc>
+          <w:tcPr>
+            <w:tcW w:type="dxa" w:w="1584"/>
+            <w:shd w:fill="0F172A"/>
+          </w:tcPr>
+          <w:p>
+            <w:r>
+              <w:rPr>
+                <w:b/>
+                <w:color w:val="FFFFFF"/>
+                <w:sz w:val="18"/>
+              </w:rPr>
+              <w:t>Group</w:t>
+            </w:r>
+          </w:p>
+        </w:tc>
+        <w:tc>
+          <w:tcPr>
+            <w:tcW w:type="dxa" w:w="3024"/>
+            <w:shd w:fill="0F172A"/>
+          </w:tcPr>
+          <w:p>
+            <w:r>
+              <w:rPr>
+                <w:b/>
+                <w:color w:val="FFFFFF"/>
+                <w:sz w:val="18"/>
+              </w:rPr>
+              <w:t>Assigned Project Role</w:t>
+            </w:r>
+          </w:p>
+        </w:tc>
+      </w:tr>
+      <w:tr>
+        <w:tc>
+          <w:tcPr>
+            <w:tcW w:type="dxa" w:w="3168"/>
+            <w:shd w:fill="F8FAFC"/>
+            <w:tcMar>
+              <w:top w:w="50" w:type="dxa"/>
+              <w:bottom w:w="50" w:type="dxa"/>
+              <w:left w:w="80" w:type="dxa"/>
+              <w:right w:w="80" w:type="dxa"/>
+            </w:tcMar>
+          </w:tcPr>
+          <w:p>
+            <w:r>
+              <w:rPr>
+                <w:b/>
+                <w:sz w:val="17"/>
+              </w:rPr>
+              <w:t>Abdelrahman Ibrahim El-Saeed</w:t>
+            </w:r>
+          </w:p>
+        </w:tc>
+        <w:tc>
+          <w:tcPr>
+            <w:tcW w:type="dxa" w:w="1584"/>
+            <w:shd w:fill="F8FAFC"/>
+            <w:tcMar>
+              <w:top w:w="50" w:type="dxa"/>
+              <w:bottom w:w="50" w:type="dxa"/>
+              <w:left w:w="80" w:type="dxa"/>
+              <w:right w:w="80" w:type="dxa"/>
+            </w:tcMar>
+          </w:tcPr>
+          <w:p>
+            <w:r>
+              <w:rPr>
+                <w:sz w:val="17"/>
+              </w:rPr>
+              <w:t>42510554</w:t>
+            </w:r>
+          </w:p>
+        </w:tc>
+        <w:tc>
+          <w:tcPr>
+            <w:tcW w:type="dxa" w:w="1584"/>
+            <w:shd w:fill="F8FAFC"/>
+            <w:tcMar>
+              <w:top w:w="50" w:type="dxa"/>
+              <w:bottom w:w="50" w:type="dxa"/>
+              <w:left w:w="80" w:type="dxa"/>
+              <w:right w:w="80" w:type="dxa"/>
+            </w:tcMar>
+          </w:tcPr>
+          <w:p>
+            <w:r>
+              <w:rPr>
+                <w:sz w:val="17"/>
+              </w:rPr>
+              <w:t>Group A</w:t>
+            </w:r>
+          </w:p>
+        </w:tc>
+        <w:tc>
+          <w:tcPr>
+            <w:tcW w:type="dxa" w:w="3024"/>
+            <w:shd w:fill="F8FAFC"/>
+            <w:tcMar>
+              <w:top w:w="50" w:type="dxa"/>
+              <w:bottom w:w="50" w:type="dxa"/>
+              <w:left w:w="80" w:type="dxa"/>
+              <w:right w:w="80" w:type="dxa"/>
+            </w:tcMar>
+          </w:tcPr>
+          <w:p>
+            <w:r>
+              <w:rPr>
+                <w:sz w:val="17"/>
+              </w:rPr>
+              <w:t>Dashboard Architecture &amp; Visual Design</w:t>
+            </w:r>
+          </w:p>
+        </w:tc>
+      </w:tr>
+      <w:tr>
+        <w:tc>
+          <w:tcPr>
+            <w:tcW w:type="dxa" w:w="3168"/>
+            <w:shd w:fill="FFFFFF"/>
+            <w:tcMar>
+              <w:top w:w="50" w:type="dxa"/>
+              <w:bottom w:w="50" w:type="dxa"/>
+              <w:left w:w="80" w:type="dxa"/>
+              <w:right w:w="80" w:type="dxa"/>
+            </w:tcMar>
+          </w:tcPr>
+          <w:p>
+            <w:r>
+              <w:rPr>
+                <w:b/>
+                <w:sz w:val="17"/>
+              </w:rPr>
+              <w:t>Ahmed Mohamed Talaat</w:t>
+            </w:r>
+          </w:p>
+        </w:tc>
+        <w:tc>
+          <w:tcPr>
+            <w:tcW w:type="dxa" w:w="1584"/>
+            <w:shd w:fill="FFFFFF"/>
+            <w:tcMar>
+              <w:top w:w="50" w:type="dxa"/>
+              <w:bottom w:w="50" w:type="dxa"/>
+              <w:left w:w="80" w:type="dxa"/>
+              <w:right w:w="80" w:type="dxa"/>
+            </w:tcMar>
+          </w:tcPr>
+          <w:p>
+            <w:r>
+              <w:rPr>
+                <w:sz w:val="17"/>
+              </w:rPr>
+              <w:t>42510635</w:t>
+            </w:r>
+          </w:p>
+        </w:tc>
+        <w:tc>
+          <w:tcPr>
+            <w:tcW w:type="dxa" w:w="1584"/>
+            <w:shd w:fill="FFFFFF"/>
+            <w:tcMar>
+              <w:top w:w="50" w:type="dxa"/>
+              <w:bottom w:w="50" w:type="dxa"/>
+              <w:left w:w="80" w:type="dxa"/>
+              <w:right w:w="80" w:type="dxa"/>
+            </w:tcMar>
+          </w:tcPr>
+          <w:p>
+            <w:r>
+              <w:rPr>
+                <w:sz w:val="17"/>
+              </w:rPr>
+              <w:t>Group A</w:t>
+            </w:r>
+          </w:p>
+        </w:tc>
+        <w:tc>
+          <w:tcPr>
+            <w:tcW w:type="dxa" w:w="3024"/>
+            <w:shd w:fill="FFFFFF"/>
+            <w:tcMar>
+              <w:top w:w="50" w:type="dxa"/>
+              <w:bottom w:w="50" w:type="dxa"/>
+              <w:left w:w="80" w:type="dxa"/>
+              <w:right w:w="80" w:type="dxa"/>
+            </w:tcMar>
+          </w:tcPr>
+          <w:p>
+            <w:r>
+              <w:rPr>
+                <w:sz w:val="17"/>
+              </w:rPr>
+              <w:t>Data Cleaning, Preprocessing &amp; Feature Engineering</w:t>
+            </w:r>
+          </w:p>
+        </w:tc>
+      </w:tr>
+      <w:tr>
+        <w:tc>
+          <w:tcPr>
+            <w:tcW w:type="dxa" w:w="3168"/>
+            <w:shd w:fill="F8FAFC"/>
+            <w:tcMar>
+              <w:top w:w="50" w:type="dxa"/>
+              <w:bottom w:w="50" w:type="dxa"/>
+              <w:left w:w="80" w:type="dxa"/>
+              <w:right w:w="80" w:type="dxa"/>
+            </w:tcMar>
+          </w:tcPr>
+          <w:p>
+            <w:r>
+              <w:rPr>
+                <w:b/>
+                <w:sz w:val="17"/>
+              </w:rPr>
+              <w:t>Ali wael Mohamed</w:t>
+            </w:r>
+          </w:p>
+        </w:tc>
+        <w:tc>
+          <w:tcPr>
+            <w:tcW w:type="dxa" w:w="1584"/>
+            <w:shd w:fill="F8FAFC"/>
+            <w:tcMar>
+              <w:top w:w="50" w:type="dxa"/>
+              <w:bottom w:w="50" w:type="dxa"/>
+              <w:left w:w="80" w:type="dxa"/>
+              <w:right w:w="80" w:type="dxa"/>
+            </w:tcMar>
+          </w:tcPr>
+          <w:p>
+            <w:r>
+              <w:rPr>
+                <w:sz w:val="17"/>
+              </w:rPr>
+              <w:t>42510325</w:t>
+            </w:r>
+          </w:p>
+        </w:tc>
+        <w:tc>
+          <w:tcPr>
+            <w:tcW w:type="dxa" w:w="1584"/>
+            <w:shd w:fill="F8FAFC"/>
+            <w:tcMar>
+              <w:top w:w="50" w:type="dxa"/>
+              <w:bottom w:w="50" w:type="dxa"/>
+              <w:left w:w="80" w:type="dxa"/>
+              <w:right w:w="80" w:type="dxa"/>
+            </w:tcMar>
+          </w:tcPr>
+          <w:p>
+            <w:r>
+              <w:rPr>
+                <w:sz w:val="17"/>
+              </w:rPr>
+              <w:t>Group C</w:t>
+            </w:r>
+          </w:p>
+        </w:tc>
+        <w:tc>
+          <w:tcPr>
+            <w:tcW w:type="dxa" w:w="3024"/>
+            <w:shd w:fill="F8FAFC"/>
+            <w:tcMar>
+              <w:top w:w="50" w:type="dxa"/>
+              <w:bottom w:w="50" w:type="dxa"/>
+              <w:left w:w="80" w:type="dxa"/>
+              <w:right w:w="80" w:type="dxa"/>
+            </w:tcMar>
+          </w:tcPr>
+          <w:p>
+            <w:r>
+              <w:rPr>
+                <w:sz w:val="17"/>
+              </w:rPr>
+              <w:t>KPI Metrics, Descriptive Elements &amp; Visual Analysis</w:t>
+            </w:r>
+          </w:p>
+        </w:tc>
+      </w:tr>
+      <w:tr>
+        <w:tc>
+          <w:tcPr>
+            <w:tcW w:type="dxa" w:w="3168"/>
+            <w:shd w:fill="FFFFFF"/>
+            <w:tcMar>
+              <w:top w:w="50" w:type="dxa"/>
+              <w:bottom w:w="50" w:type="dxa"/>
+              <w:left w:w="80" w:type="dxa"/>
+              <w:right w:w="80" w:type="dxa"/>
+            </w:tcMar>
+          </w:tcPr>
+          <w:p>
+            <w:r>
+              <w:rPr>
+                <w:b/>
+                <w:sz w:val="17"/>
+              </w:rPr>
+              <w:t>Ali Mohamed abed</w:t>
+            </w:r>
+          </w:p>
+        </w:tc>
+        <w:tc>
+          <w:tcPr>
+            <w:tcW w:type="dxa" w:w="1584"/>
+            <w:shd w:fill="FFFFFF"/>
+            <w:tcMar>
+              <w:top w:w="50" w:type="dxa"/>
+              <w:bottom w:w="50" w:type="dxa"/>
+              <w:left w:w="80" w:type="dxa"/>
+              <w:right w:w="80" w:type="dxa"/>
+            </w:tcMar>
+          </w:tcPr>
+          <w:p>
+            <w:r>
+              <w:rPr>
+                <w:sz w:val="17"/>
+              </w:rPr>
+              <w:t>42510161</w:t>
+            </w:r>
+          </w:p>
+        </w:tc>
+        <w:tc>
+          <w:tcPr>
+            <w:tcW w:type="dxa" w:w="1584"/>
+            <w:shd w:fill="FFFFFF"/>
+            <w:tcMar>
+              <w:top w:w="50" w:type="dxa"/>
+              <w:bottom w:w="50" w:type="dxa"/>
+              <w:left w:w="80" w:type="dxa"/>
+              <w:right w:w="80" w:type="dxa"/>
+            </w:tcMar>
+          </w:tcPr>
+          <w:p>
+            <w:r>
+              <w:rPr>
+                <w:sz w:val="17"/>
+              </w:rPr>
+              <w:t>Group C</w:t>
+            </w:r>
+          </w:p>
+        </w:tc>
+        <w:tc>
+          <w:tcPr>
+            <w:tcW w:type="dxa" w:w="3024"/>
+            <w:shd w:fill="FFFFFF"/>
+            <w:tcMar>
+              <w:top w:w="50" w:type="dxa"/>
+              <w:bottom w:w="50" w:type="dxa"/>
+              <w:left w:w="80" w:type="dxa"/>
+              <w:right w:w="80" w:type="dxa"/>
+            </w:tcMar>
+          </w:tcPr>
+          <w:p>
+            <w:r>
+              <w:rPr>
+                <w:sz w:val="17"/>
+              </w:rPr>
+              <w:t>Statistical Insights &amp; Findings Interpretation</w:t>
+            </w:r>
+          </w:p>
+        </w:tc>
+      </w:tr>
+      <w:tr>
+        <w:tc>
+          <w:tcPr>
+            <w:tcW w:type="dxa" w:w="3168"/>
+            <w:shd w:fill="F8FAFC"/>
+            <w:tcMar>
+              <w:top w:w="50" w:type="dxa"/>
+              <w:bottom w:w="50" w:type="dxa"/>
+              <w:left w:w="80" w:type="dxa"/>
+              <w:right w:w="80" w:type="dxa"/>
+            </w:tcMar>
+          </w:tcPr>
+          <w:p>
+            <w:r>
+              <w:rPr>
+                <w:b/>
+                <w:sz w:val="17"/>
+              </w:rPr>
+              <w:t>Ahmed Abdullah elmetwaly</w:t>
+            </w:r>
+          </w:p>
+        </w:tc>
+        <w:tc>
+          <w:tcPr>
+            <w:tcW w:type="dxa" w:w="1584"/>
+            <w:shd w:fill="F8FAFC"/>
+            <w:tcMar>
+              <w:top w:w="50" w:type="dxa"/>
+              <w:bottom w:w="50" w:type="dxa"/>
+              <w:left w:w="80" w:type="dxa"/>
+              <w:right w:w="80" w:type="dxa"/>
+            </w:tcMar>
+          </w:tcPr>
+          <w:p>
+            <w:r>
+              <w:rPr>
+                <w:sz w:val="17"/>
+              </w:rPr>
+              <w:t>42510160</w:t>
+            </w:r>
+          </w:p>
+        </w:tc>
+        <w:tc>
+          <w:tcPr>
+            <w:tcW w:type="dxa" w:w="1584"/>
+            <w:shd w:fill="F8FAFC"/>
+            <w:tcMar>
+              <w:top w:w="50" w:type="dxa"/>
+              <w:bottom w:w="50" w:type="dxa"/>
+              <w:left w:w="80" w:type="dxa"/>
+              <w:right w:w="80" w:type="dxa"/>
+            </w:tcMar>
+          </w:tcPr>
+          <w:p>
+            <w:r>
+              <w:rPr>
+                <w:sz w:val="17"/>
+              </w:rPr>
+              <w:t>Group C</w:t>
+            </w:r>
+          </w:p>
+        </w:tc>
+        <w:tc>
+          <w:tcPr>
+            <w:tcW w:type="dxa" w:w="3024"/>
+            <w:shd w:fill="F8FAFC"/>
+            <w:tcMar>
+              <w:top w:w="50" w:type="dxa"/>
+              <w:bottom w:w="50" w:type="dxa"/>
+              <w:left w:w="80" w:type="dxa"/>
+              <w:right w:w="80" w:type="dxa"/>
+            </w:tcMar>
+          </w:tcPr>
+          <w:p>
+            <w:r>
+              <w:rPr>
+                <w:sz w:val="17"/>
+              </w:rPr>
+              <w:t>Strategic Recommendations &amp; Documentation</w:t>
+            </w:r>
+          </w:p>
+        </w:tc>
+      </w:tr>
+    </w:tbl>
+    <w:p>
+      <w:pPr>
+        <w:spacing w:after="160"/>
+      </w:pPr>
+    </w:p>
+    <w:tbl>
+      <w:tblPr>
+        <w:tblW w:type="auto" w:w="0"/>
+        <w:jc w:val="center"/>
         <w:tblLook w:firstColumn="1" w:firstRow="1" w:lastColumn="0" w:lastRow="0" w:noHBand="0" w:noVBand="1" w:val="04A0"/>
       </w:tblPr>
       <w:tblGrid>
@@ -41,12 +541,12 @@
         <w:tc>
           <w:tcPr>
             <w:tcW w:type="dxa" w:w="9360"/>
-            <w:shd w:fill="F1F5F9"/>
+            <w:shd w:fill="F0F9FF"/>
             <w:tcMar>
-              <w:top w:w="140" w:type="dxa"/>
-              <w:bottom w:w="140" w:type="dxa"/>
-              <w:left w:w="200" w:type="dxa"/>
-              <w:right w:w="200" w:type="dxa"/>
+              <w:top w:w="120" w:type="dxa"/>
+              <w:bottom w:w="120" w:type="dxa"/>
+              <w:left w:w="160" w:type="dxa"/>
+              <w:right w:w="160" w:type="dxa"/>
             </w:tcMar>
           </w:tcPr>
           <w:p>
@@ -57,40 +557,67 @@
               <w:rPr>
                 <w:b/>
               </w:rPr>
-              <w:t xml:space="preserve">Course / Assignment: </w:t>
-            </w:r>
-            <w:r>
-              <w:t>Data Visualization &amp; Business Dashboard Development</w:t>
+              <w:t>🔗 DIRECT SUBMISSION LINKS &amp; ONLINE RESOURCES (CLICK TO OPEN):</w:t>
               <w:br/>
             </w:r>
             <w:r>
               <w:rPr>
                 <w:b/>
               </w:rPr>
-              <w:t xml:space="preserve">Submission Deliverables: </w:t>
+              <w:t xml:space="preserve">• Live Interactive Web Dashboard: </w:t>
             </w:r>
             <w:r>
-              <w:t>Interactive HTML Dashboard, High-Res Image/PDF, Cleaned Datasets (CSV/XLSX), Technical Report</w:t>
+              <w:t>https://eng-hegazy.github.io/data-project/  (or HTMLPreview: https://htmlpreview.github.io/?https://github.com/Eng-Hegazy/data-project/blob/main/ecommerce_dashboard.html)</w:t>
               <w:br/>
             </w:r>
             <w:r>
               <w:rPr>
                 <w:b/>
               </w:rPr>
-              <w:t xml:space="preserve">Dataset Scope: </w:t>
+              <w:t xml:space="preserve">• GitHub Project Repository: </w:t>
             </w:r>
             <w:r>
-              <w:t>2,500 Omnichannel E-Commerce Orders across North America (2024 - 2025)</w:t>
+              <w:t>https://github.com/Eng-Hegazy/data-project</w:t>
               <w:br/>
             </w:r>
             <w:r>
               <w:rPr>
                 <w:b/>
               </w:rPr>
-              <w:t xml:space="preserve">Implementation Tool: </w:t>
+              <w:t xml:space="preserve">• Original Raw Dataset (CSV): </w:t>
             </w:r>
             <w:r>
-              <w:t>Python (Pandas, Matplotlib, ReportLab, OpenPyXL, HTML5/Chart.js)</w:t>
+              <w:t>https://raw.githubusercontent.com/Eng-Hegazy/data-project/main/ecommerce_sales_raw.csv</w:t>
+              <w:br/>
+            </w:r>
+            <w:r>
+              <w:rPr>
+                <w:b/>
+              </w:rPr>
+              <w:t xml:space="preserve">• Cleaned &amp; Processed Dataset (CSV): </w:t>
+            </w:r>
+            <w:r>
+              <w:t>https://raw.githubusercontent.com/Eng-Hegazy/data-project/main/ecommerce_sales_cleaned.csv</w:t>
+              <w:br/>
+            </w:r>
+            <w:r>
+              <w:rPr>
+                <w:b/>
+              </w:rPr>
+              <w:t xml:space="preserve">• High-Resolution Dashboard Graphic (PNG / 300 DPI): </w:t>
+            </w:r>
+            <w:r>
+              <w:t>https://raw.githubusercontent.com/Eng-Hegazy/data-project/main/ecommerce_dashboard.png</w:t>
+              <w:br/>
+            </w:r>
+            <w:r>
+              <w:rPr>
+                <w:b/>
+              </w:rPr>
+              <w:t xml:space="preserve">• Standalone Vector Dashboard (PDF): </w:t>
+            </w:r>
+            <w:r>
+              <w:t>https://raw.githubusercontent.com/Eng-Hegazy/data-project/main/ecommerce_dashboard.pdf</w:t>
             </w:r>
           </w:p>
         </w:tc>

</xml_diff>

<commit_message>
Update PDF and DOCX reports with prominent direct dataset and resource download links for single-file submission
</commit_message>
<xml_diff>
--- a/Dashboard_Description_Report.docx
+++ b/Dashboard_Description_Report.docx
@@ -543,10 +543,10 @@
             <w:tcW w:type="dxa" w:w="9360"/>
             <w:shd w:fill="F0F9FF"/>
             <w:tcMar>
-              <w:top w:w="120" w:type="dxa"/>
-              <w:bottom w:w="120" w:type="dxa"/>
-              <w:left w:w="160" w:type="dxa"/>
-              <w:right w:w="160" w:type="dxa"/>
+              <w:top w:w="140" w:type="dxa"/>
+              <w:bottom w:w="140" w:type="dxa"/>
+              <w:left w:w="180" w:type="dxa"/>
+              <w:right w:w="180" w:type="dxa"/>
             </w:tcMar>
           </w:tcPr>
           <w:p>
@@ -557,7 +557,37 @@
               <w:rPr>
                 <w:b/>
               </w:rPr>
-              <w:t>🔗 DIRECT SUBMISSION LINKS &amp; ONLINE RESOURCES (CLICK TO OPEN):</w:t>
+              <w:t>🔗 DIRECT SUBMISSION &amp; DATASET DOWNLOAD LINKS (CLICKABLE &amp; COPYABLE):</w:t>
+              <w:br/>
+            </w:r>
+            <w:r>
+              <w:rPr>
+                <w:b/>
+              </w:rPr>
+              <w:t xml:space="preserve">• Original Raw Dataset (Direct Download CSV): </w:t>
+            </w:r>
+            <w:r>
+              <w:t>https://raw.githubusercontent.com/Eng-Hegazy/data-project/main/ecommerce_sales_raw.csv</w:t>
+              <w:br/>
+            </w:r>
+            <w:r>
+              <w:rPr>
+                <w:b/>
+              </w:rPr>
+              <w:t xml:space="preserve">• Cleaned Dataset (Direct Download CSV): </w:t>
+            </w:r>
+            <w:r>
+              <w:t>https://raw.githubusercontent.com/Eng-Hegazy/data-project/main/ecommerce_sales_cleaned.csv</w:t>
+              <w:br/>
+            </w:r>
+            <w:r>
+              <w:rPr>
+                <w:b/>
+              </w:rPr>
+              <w:t xml:space="preserve">• Cleaned Dataset in Excel (Direct Download .xlsx): </w:t>
+            </w:r>
+            <w:r>
+              <w:t>https://github.com/Eng-Hegazy/data-project/raw/main/ecommerce_sales_cleaned.xlsx</w:t>
               <w:br/>
             </w:r>
             <w:r>
@@ -567,14 +597,14 @@
               <w:t xml:space="preserve">• Live Interactive Web Dashboard: </w:t>
             </w:r>
             <w:r>
-              <w:t>https://eng-hegazy.github.io/data-project/  (or HTMLPreview: https://htmlpreview.github.io/?https://github.com/Eng-Hegazy/data-project/blob/main/ecommerce_dashboard.html)</w:t>
+              <w:t>https://eng-hegazy.github.io/data-project/  (Alternative: https://htmlpreview.github.io/?https://github.com/Eng-Hegazy/data-project/blob/main/ecommerce_dashboard.html)</w:t>
               <w:br/>
             </w:r>
             <w:r>
               <w:rPr>
                 <w:b/>
               </w:rPr>
-              <w:t xml:space="preserve">• GitHub Project Repository: </w:t>
+              <w:t xml:space="preserve">• GitHub Full Project Repository: </w:t>
             </w:r>
             <w:r>
               <w:t>https://github.com/Eng-Hegazy/data-project</w:t>
@@ -584,20 +614,10 @@
               <w:rPr>
                 <w:b/>
               </w:rPr>
-              <w:t xml:space="preserve">• Original Raw Dataset (CSV): </w:t>
+              <w:t xml:space="preserve">• Standalone Master Submission PDF: </w:t>
             </w:r>
             <w:r>
-              <w:t>https://raw.githubusercontent.com/Eng-Hegazy/data-project/main/ecommerce_sales_raw.csv</w:t>
-              <w:br/>
-            </w:r>
-            <w:r>
-              <w:rPr>
-                <w:b/>
-              </w:rPr>
-              <w:t xml:space="preserve">• Cleaned &amp; Processed Dataset (CSV): </w:t>
-            </w:r>
-            <w:r>
-              <w:t>https://raw.githubusercontent.com/Eng-Hegazy/data-project/main/ecommerce_sales_cleaned.csv</w:t>
+              <w:t>https://github.com/Eng-Hegazy/data-project/blob/main/Ecommerce_Dashboard_Final_Submission.pdf</w:t>
               <w:br/>
             </w:r>
             <w:r>
@@ -608,16 +628,6 @@
             </w:r>
             <w:r>
               <w:t>https://raw.githubusercontent.com/Eng-Hegazy/data-project/main/ecommerce_dashboard.png</w:t>
-              <w:br/>
-            </w:r>
-            <w:r>
-              <w:rPr>
-                <w:b/>
-              </w:rPr>
-              <w:t xml:space="preserve">• Standalone Vector Dashboard (PDF): </w:t>
-            </w:r>
-            <w:r>
-              <w:t>https://raw.githubusercontent.com/Eng-Hegazy/data-project/main/ecommerce_dashboard.pdf</w:t>
             </w:r>
           </w:p>
         </w:tc>

</xml_diff>

<commit_message>
Update submission files with 100% verified working interactive dashboard and direct download links
</commit_message>
<xml_diff>
--- a/Dashboard_Description_Report.docx
+++ b/Dashboard_Description_Report.docx
@@ -557,7 +557,17 @@
               <w:rPr>
                 <w:b/>
               </w:rPr>
-              <w:t>🔗 DIRECT SUBMISSION &amp; DATASET DOWNLOAD LINKS (CLICKABLE &amp; COPYABLE):</w:t>
+              <w:t>🔗 DIRECT SUBMISSION &amp; DATASET DOWNLOAD LINKS (100% TESTED &amp; VERIFIED):</w:t>
+              <w:br/>
+            </w:r>
+            <w:r>
+              <w:rPr>
+                <w:b/>
+              </w:rPr>
+              <w:t xml:space="preserve">• Live Interactive Web Dashboard: </w:t>
+            </w:r>
+            <w:r>
+              <w:t>https://htmlpreview.github.io/?https://github.com/Eng-Hegazy/data-project/blob/main/ecommerce_dashboard.html</w:t>
               <w:br/>
             </w:r>
             <w:r>
@@ -588,16 +598,6 @@
             </w:r>
             <w:r>
               <w:t>https://github.com/Eng-Hegazy/data-project/raw/main/ecommerce_sales_cleaned.xlsx</w:t>
-              <w:br/>
-            </w:r>
-            <w:r>
-              <w:rPr>
-                <w:b/>
-              </w:rPr>
-              <w:t xml:space="preserve">• Live Interactive Web Dashboard: </w:t>
-            </w:r>
-            <w:r>
-              <w:t>https://eng-hegazy.github.io/data-project/  (Alternative: https://htmlpreview.github.io/?https://github.com/Eng-Hegazy/data-project/blob/main/ecommerce_dashboard.html)</w:t>
               <w:br/>
             </w:r>
             <w:r>

</xml_diff>

<commit_message>
Add Yousef Vector (ID: 42510792, Group: G) to project team across all submission files and reports
</commit_message>
<xml_diff>
--- a/Dashboard_Description_Report.docx
+++ b/Dashboard_Description_Report.docx
@@ -518,6 +518,89 @@
                 <w:sz w:val="17"/>
               </w:rPr>
               <w:t>Strategic Recommendations &amp; Documentation</w:t>
+            </w:r>
+          </w:p>
+        </w:tc>
+      </w:tr>
+      <w:tr>
+        <w:tc>
+          <w:tcPr>
+            <w:tcW w:type="dxa" w:w="3168"/>
+            <w:shd w:fill="FFFFFF"/>
+            <w:tcMar>
+              <w:top w:w="50" w:type="dxa"/>
+              <w:bottom w:w="50" w:type="dxa"/>
+              <w:left w:w="80" w:type="dxa"/>
+              <w:right w:w="80" w:type="dxa"/>
+            </w:tcMar>
+          </w:tcPr>
+          <w:p>
+            <w:r>
+              <w:rPr>
+                <w:b/>
+                <w:sz w:val="17"/>
+              </w:rPr>
+              <w:t>Yousef Vector</w:t>
+            </w:r>
+          </w:p>
+        </w:tc>
+        <w:tc>
+          <w:tcPr>
+            <w:tcW w:type="dxa" w:w="1584"/>
+            <w:shd w:fill="FFFFFF"/>
+            <w:tcMar>
+              <w:top w:w="50" w:type="dxa"/>
+              <w:bottom w:w="50" w:type="dxa"/>
+              <w:left w:w="80" w:type="dxa"/>
+              <w:right w:w="80" w:type="dxa"/>
+            </w:tcMar>
+          </w:tcPr>
+          <w:p>
+            <w:r>
+              <w:rPr>
+                <w:sz w:val="17"/>
+              </w:rPr>
+              <w:t>42510792</w:t>
+            </w:r>
+          </w:p>
+        </w:tc>
+        <w:tc>
+          <w:tcPr>
+            <w:tcW w:type="dxa" w:w="1584"/>
+            <w:shd w:fill="FFFFFF"/>
+            <w:tcMar>
+              <w:top w:w="50" w:type="dxa"/>
+              <w:bottom w:w="50" w:type="dxa"/>
+              <w:left w:w="80" w:type="dxa"/>
+              <w:right w:w="80" w:type="dxa"/>
+            </w:tcMar>
+          </w:tcPr>
+          <w:p>
+            <w:r>
+              <w:rPr>
+                <w:sz w:val="17"/>
+              </w:rPr>
+              <w:t>Group G</w:t>
+            </w:r>
+          </w:p>
+        </w:tc>
+        <w:tc>
+          <w:tcPr>
+            <w:tcW w:type="dxa" w:w="3024"/>
+            <w:shd w:fill="FFFFFF"/>
+            <w:tcMar>
+              <w:top w:w="50" w:type="dxa"/>
+              <w:bottom w:w="50" w:type="dxa"/>
+              <w:left w:w="80" w:type="dxa"/>
+              <w:right w:w="80" w:type="dxa"/>
+            </w:tcMar>
+          </w:tcPr>
+          <w:p>
+            <w:r>
+              <w:rPr>
+                <w:sz w:val="17"/>
+              </w:rPr>
+              <w:t>Data Modeling &amp; Quality Assurance Verification</w:t>
             </w:r>
           </w:p>
         </w:tc>

</xml_diff>